<commit_message>
Add footers, rubrics, offertory QR code, and fix bold font weight
- Add odd/even page footers with page numbers and service info
- Add psalm reading rubric, "Please stand." before closing prayer,
  and dismissal rubric wording fix
- Add offertory rubric with mixed fonts and floating QR code image
- Fix Adobe Garamond Pro Bold: use explicit "Adobe Garamond Pro Bold"
  font name so Word uses the real bold weight instead of faux bold
- Fix preface joining logic for Lenten proper prefaces
- Fix POP cross spacing when {departed} is empty
- Add penitential sentence verse reference in italics
- Add right-column lyrics style with wider hanging indent
- Fix read-only file issue by deleting output before saving

Co-Authored-By: Claude Opus 4.6 <noreply@anthropic.com>
</commit_message>
<xml_diff>
--- a/templates/back_cover.docx
+++ b/templates/back_cover.docx
@@ -122,30 +122,26 @@
     </w:p>
     <w:p>
       <w:pPr>
-        <w:rPr>
-          <w:rFonts w:ascii="Adobe Garamond Pro" w:hAnsi="Adobe Garamond Pro" w:cs="Adobe Garamond Pro"/>
-          <w:i/>
-          <w:iCs/>
-          <w:color w:val="000000"/>
-          <w:sz w:val="20"/>
-          <w:szCs w:val="20"/>
-        </w:rPr>
+        <w:pStyle w:val="Body-IntroductoryRubric"/>
       </w:pPr>
       <w:r>
-        <w:rPr>
-          <w:rFonts w:ascii="Adobe Garamond Pro" w:hAnsi="Adobe Garamond Pro" w:cs="Adobe Garamond Pro"/>
-          <w:i/>
-          <w:iCs/>
-          <w:color w:val="000000"/>
-          <w:sz w:val="20"/>
-          <w:szCs w:val="20"/>
-        </w:rPr>
         <w:t>The text of the service of worship contained in this program is taken from the Book of Common Prayer 1979. The Book of Common Prayer alone is of authority in the worship of the Episcopal Church. This program is provided for convenience of use on this occasion. CCLI License No. 2626819</w:t>
       </w:r>
     </w:p>
     <w:p>
       <w:pPr>
+        <w:pStyle w:val="Spacer-Small"/>
+      </w:pPr>
+    </w:p>
+    <w:p>
+      <w:pPr>
+        <w:pStyle w:val="Spacer-Small"/>
+      </w:pPr>
+    </w:p>
+    <w:p>
+      <w:pPr>
         <w:pStyle w:val="Heading"/>
+        <w:spacing w:before="0"/>
       </w:pPr>
       <w:r>
         <w:t>St. Andrew’s Staff and Vestry</w:t>

</xml_diff>